<commit_message>
Fix card layout for Herlitz sheet: 12.5mm side strips and 15mm gap between columns
Co-Authored-By: Claude Sonnet 5.5 <noreply@anthropic.com>
Claude-Session: https://claude.ai/code/session_01G3kJJv5ZMtHLoUD3GYkfyP
</commit_message>
<xml_diff>
--- a/business-card/inkvial-business-cards-10-back.docx
+++ b/business-card/inkvial-business-cards-10-back.docx
@@ -4,13 +4,14 @@
   <w:body>
     <w:tbl>
       <w:tblPr>
-        <w:tblW w:type="auto" w:w="0"/>
+        <w:tblW w:type="dxa" w:w="10488"/>
         <w:jc w:val="center"/>
         <w:tblLayout w:type="fixed"/>
         <w:tblLook w:firstColumn="1" w:firstRow="1" w:lastColumn="0" w:lastRow="0" w:noHBand="0" w:noVBand="1" w:val="04A0"/>
       </w:tblPr>
       <w:tblGrid>
         <w:gridCol w:w="4819"/>
+        <w:gridCol w:w="850"/>
         <w:gridCol w:w="4819"/>
       </w:tblGrid>
       <w:tr>
@@ -81,6 +82,31 @@
                 </wp:inline>
               </w:drawing>
             </w:r>
+          </w:p>
+        </w:tc>
+        <w:tc>
+          <w:tcPr>
+            <w:tcW w:type="dxa" w:w="850"/>
+            <w:tcBorders>
+              <w:top w:val="nil"/>
+              <w:left w:val="nil"/>
+              <w:bottom w:val="nil"/>
+              <w:right w:val="nil"/>
+            </w:tcBorders>
+            <w:tcMar>
+              <w:top w:w="0" w:type="dxa"/>
+              <w:left w:w="0" w:type="dxa"/>
+              <w:bottom w:w="0" w:type="dxa"/>
+              <w:right w:w="0" w:type="dxa"/>
+            </w:tcMar>
+          </w:tcPr>
+          <w:p>
+            <w:pPr>
+              <w:spacing w:after="0" w:before="0" w:line="240" w:lineRule="auto"/>
+              <w:rPr>
+                <w:sz w:val="2"/>
+              </w:rPr>
+            </w:pPr>
           </w:p>
         </w:tc>
         <w:tc>
@@ -222,6 +248,31 @@
         </w:tc>
         <w:tc>
           <w:tcPr>
+            <w:tcW w:type="dxa" w:w="850"/>
+            <w:tcBorders>
+              <w:top w:val="nil"/>
+              <w:left w:val="nil"/>
+              <w:bottom w:val="nil"/>
+              <w:right w:val="nil"/>
+            </w:tcBorders>
+            <w:tcMar>
+              <w:top w:w="0" w:type="dxa"/>
+              <w:left w:w="0" w:type="dxa"/>
+              <w:bottom w:w="0" w:type="dxa"/>
+              <w:right w:w="0" w:type="dxa"/>
+            </w:tcMar>
+          </w:tcPr>
+          <w:p>
+            <w:pPr>
+              <w:spacing w:after="0" w:before="0" w:line="240" w:lineRule="auto"/>
+              <w:rPr>
+                <w:sz w:val="2"/>
+              </w:rPr>
+            </w:pPr>
+          </w:p>
+        </w:tc>
+        <w:tc>
+          <w:tcPr>
             <w:tcW w:type="dxa" w:w="4819"/>
             <w:tcBorders>
               <w:top w:val="nil"/>
@@ -355,6 +406,31 @@
                 </wp:inline>
               </w:drawing>
             </w:r>
+          </w:p>
+        </w:tc>
+        <w:tc>
+          <w:tcPr>
+            <w:tcW w:type="dxa" w:w="850"/>
+            <w:tcBorders>
+              <w:top w:val="nil"/>
+              <w:left w:val="nil"/>
+              <w:bottom w:val="nil"/>
+              <w:right w:val="nil"/>
+            </w:tcBorders>
+            <w:tcMar>
+              <w:top w:w="0" w:type="dxa"/>
+              <w:left w:w="0" w:type="dxa"/>
+              <w:bottom w:w="0" w:type="dxa"/>
+              <w:right w:w="0" w:type="dxa"/>
+            </w:tcMar>
+          </w:tcPr>
+          <w:p>
+            <w:pPr>
+              <w:spacing w:after="0" w:before="0" w:line="240" w:lineRule="auto"/>
+              <w:rPr>
+                <w:sz w:val="2"/>
+              </w:rPr>
+            </w:pPr>
           </w:p>
         </w:tc>
         <w:tc>
@@ -496,6 +572,31 @@
         </w:tc>
         <w:tc>
           <w:tcPr>
+            <w:tcW w:type="dxa" w:w="850"/>
+            <w:tcBorders>
+              <w:top w:val="nil"/>
+              <w:left w:val="nil"/>
+              <w:bottom w:val="nil"/>
+              <w:right w:val="nil"/>
+            </w:tcBorders>
+            <w:tcMar>
+              <w:top w:w="0" w:type="dxa"/>
+              <w:left w:w="0" w:type="dxa"/>
+              <w:bottom w:w="0" w:type="dxa"/>
+              <w:right w:w="0" w:type="dxa"/>
+            </w:tcMar>
+          </w:tcPr>
+          <w:p>
+            <w:pPr>
+              <w:spacing w:after="0" w:before="0" w:line="240" w:lineRule="auto"/>
+              <w:rPr>
+                <w:sz w:val="2"/>
+              </w:rPr>
+            </w:pPr>
+          </w:p>
+        </w:tc>
+        <w:tc>
+          <w:tcPr>
             <w:tcW w:type="dxa" w:w="4819"/>
             <w:tcBorders>
               <w:top w:val="nil"/>
@@ -633,6 +734,31 @@
         </w:tc>
         <w:tc>
           <w:tcPr>
+            <w:tcW w:type="dxa" w:w="850"/>
+            <w:tcBorders>
+              <w:top w:val="nil"/>
+              <w:left w:val="nil"/>
+              <w:bottom w:val="nil"/>
+              <w:right w:val="nil"/>
+            </w:tcBorders>
+            <w:tcMar>
+              <w:top w:w="0" w:type="dxa"/>
+              <w:left w:w="0" w:type="dxa"/>
+              <w:bottom w:w="0" w:type="dxa"/>
+              <w:right w:w="0" w:type="dxa"/>
+            </w:tcMar>
+          </w:tcPr>
+          <w:p>
+            <w:pPr>
+              <w:spacing w:after="0" w:before="0" w:line="240" w:lineRule="auto"/>
+              <w:rPr>
+                <w:sz w:val="2"/>
+              </w:rPr>
+            </w:pPr>
+          </w:p>
+        </w:tc>
+        <w:tc>
+          <w:tcPr>
             <w:tcW w:type="dxa" w:w="4819"/>
             <w:tcBorders>
               <w:top w:val="nil"/>
@@ -701,7 +827,7 @@
     </w:tbl>
     <w:sectPr>
       <w:pgSz w:w="11906" w:h="16838"/>
-      <w:pgMar w:top="624" w:right="1134" w:bottom="283" w:left="1134" w:header="720" w:footer="720" w:gutter="0"/>
+      <w:pgMar w:top="624" w:right="709" w:bottom="283" w:left="709" w:header="720" w:footer="720" w:gutter="0"/>
       <w:cols w:space="720"/>
       <w:docGrid w:linePitch="360"/>
     </w:sectPr>

</xml_diff>

<commit_message>
Correct sheet layout from photo of real print (15mm side strips, 10mm centre strip) and add print calibration page
Co-Authored-By: Claude Sonnet 5.5 <noreply@anthropic.com>
Claude-Session: https://claude.ai/code/session_01G3kJJv5ZMtHLoUD3GYkfyP
</commit_message>
<xml_diff>
--- a/business-card/inkvial-business-cards-10-back.docx
+++ b/business-card/inkvial-business-cards-10-back.docx
@@ -4,14 +4,14 @@
   <w:body>
     <w:tbl>
       <w:tblPr>
-        <w:tblW w:type="dxa" w:w="10488"/>
+        <w:tblW w:type="dxa" w:w="10205"/>
         <w:jc w:val="center"/>
         <w:tblLayout w:type="fixed"/>
         <w:tblLook w:firstColumn="1" w:firstRow="1" w:lastColumn="0" w:lastRow="0" w:noHBand="0" w:noVBand="1" w:val="04A0"/>
       </w:tblPr>
       <w:tblGrid>
         <w:gridCol w:w="4819"/>
-        <w:gridCol w:w="850"/>
+        <w:gridCol w:w="567"/>
         <w:gridCol w:w="4819"/>
       </w:tblGrid>
       <w:tr>
@@ -86,7 +86,7 @@
         </w:tc>
         <w:tc>
           <w:tcPr>
-            <w:tcW w:type="dxa" w:w="850"/>
+            <w:tcW w:type="dxa" w:w="567"/>
             <w:tcBorders>
               <w:top w:val="nil"/>
               <w:left w:val="nil"/>
@@ -248,7 +248,7 @@
         </w:tc>
         <w:tc>
           <w:tcPr>
-            <w:tcW w:type="dxa" w:w="850"/>
+            <w:tcW w:type="dxa" w:w="567"/>
             <w:tcBorders>
               <w:top w:val="nil"/>
               <w:left w:val="nil"/>
@@ -410,7 +410,7 @@
         </w:tc>
         <w:tc>
           <w:tcPr>
-            <w:tcW w:type="dxa" w:w="850"/>
+            <w:tcW w:type="dxa" w:w="567"/>
             <w:tcBorders>
               <w:top w:val="nil"/>
               <w:left w:val="nil"/>
@@ -572,7 +572,7 @@
         </w:tc>
         <w:tc>
           <w:tcPr>
-            <w:tcW w:type="dxa" w:w="850"/>
+            <w:tcW w:type="dxa" w:w="567"/>
             <w:tcBorders>
               <w:top w:val="nil"/>
               <w:left w:val="nil"/>
@@ -734,7 +734,7 @@
         </w:tc>
         <w:tc>
           <w:tcPr>
-            <w:tcW w:type="dxa" w:w="850"/>
+            <w:tcW w:type="dxa" w:w="567"/>
             <w:tcBorders>
               <w:top w:val="nil"/>
               <w:left w:val="nil"/>
@@ -827,7 +827,7 @@
     </w:tbl>
     <w:sectPr>
       <w:pgSz w:w="11906" w:h="16838"/>
-      <w:pgMar w:top="624" w:right="709" w:bottom="283" w:left="709" w:header="720" w:footer="720" w:gutter="0"/>
+      <w:pgMar w:top="624" w:right="850" w:bottom="283" w:left="850" w:header="720" w:footer="720" w:gutter="0"/>
       <w:cols w:space="720"/>
       <w:docGrid w:linePitch="360"/>
     </w:sectPr>

</xml_diff>